<commit_message>
Hardening pass: report cover/duplicate-language fix, dev-history comment cleanup, gradio threshold/model-name bugs, notebook path robustness and duplicate-audit precision
</commit_message>
<xml_diff>
--- a/04_Report/AutoGuard_AI_Final_Report.docx
+++ b/04_Report/AutoGuard_AI_Final_Report.docx
@@ -97,7 +97,61 @@
         <w:rPr>
           <w:sz w:val="23"/>
         </w:rPr>
-        <w:t>[Student Name] – [Student ID]</w:t>
+      </w:r>
+    </w:p>
+    <w:p>
+      <w:pPr>
+        <w:jc w:val="center"/>
+      </w:pPr>
+      <w:r>
+        <w:rPr>
+          <w:sz w:val="23"/>
+        </w:rPr>
+        <w:t>Noam Eitam, 207294760</w:t>
+      </w:r>
+    </w:p>
+    <w:p>
+      <w:pPr>
+        <w:jc w:val="center"/>
+      </w:pPr>
+      <w:r>
+        <w:rPr>
+          <w:sz w:val="23"/>
+        </w:rPr>
+        <w:t>Shirel Nir, 318529203</w:t>
+      </w:r>
+    </w:p>
+    <w:p>
+      <w:pPr>
+        <w:jc w:val="center"/>
+      </w:pPr>
+      <w:r>
+        <w:rPr>
+          <w:sz w:val="23"/>
+        </w:rPr>
+        <w:t>Abanau (Nati) Workneh, 324351808</w:t>
+      </w:r>
+    </w:p>
+    <w:p>
+      <w:pPr>
+        <w:jc w:val="center"/>
+      </w:pPr>
+      <w:r>
+        <w:rPr>
+          <w:sz w:val="23"/>
+        </w:rPr>
+        <w:t>Avishai Goss, 207313701</w:t>
+      </w:r>
+    </w:p>
+    <w:p>
+      <w:pPr>
+        <w:jc w:val="center"/>
+      </w:pPr>
+      <w:r>
+        <w:rPr>
+          <w:sz w:val="23"/>
+        </w:rPr>
+        <w:t>Oz Ofir, 318339546</w:t>
       </w:r>
     </w:p>
     <w:p>
@@ -2815,7 +2869,7 @@
     </w:p>
     <w:p>
       <w:r>
-        <w:t>The project uses a single authoritative dataset, `02_Data/Car_Insurance_Claim_50000_FINAL.csv`, containing 50,000 policyholder records with 19 raw columns. Two numeric columns have modest missingness (CREDIT_SCORE and ANNUAL_MILEAGE, each under 10%), handled by median imputation; there are no full-row duplicates once the identifier column is excluded.</w:t>
+        <w:t>The project uses a single authoritative dataset, `02_Data/Car_Insurance_Claim_50000_FINAL.csv`, containing 50,000 policyholder records with 19 raw columns. Two numeric columns have modest missingness (CREDIT_SCORE and ANNUAL_MILEAGE, each under 10%), handled by median imputation; ID values are unique (0 duplicate IDs) and there are no fully duplicated rows including ID; 80 records share an identical feature profile with a different unique ID (155 rows total), retained as distinct records rather than removed as duplicates.</w:t>
       </w:r>
     </w:p>
     <w:p>

</xml_diff>